<commit_message>
Round 3: comprehensive A## build-code scrub (CHRONIC class)
Rounds 1 and 2 each fixed only the specific files AutoQC named,
never the whole class - that's what pushed "Builder A## codes
visible in world files" to a 3rd-round CHRONIC flag. Ran a_scrub.py
across the full corpus this time: 20 automatic fixes, plus 24 hand
fixes where a descriptive name already sat next to the bare code
(production_tracker.csv's doc_id column, reserve_ledger.csv,
intake_memo.docx, scene_photos, property_claim_0202.pdf,
IR_2025-1018_final.docx). Confirmed zero remaining occurrences;
the leftover A0431/A0436/A0225/A0398/A2-style matches in medical
billing PDFs are real HCPCS/room codes, not this world's artifact
IDs.

Co-Authored-By: Claude Sonnet 5 <noreply@anthropic.com>
Claude-Session: https://claude.ai/code/session_01PxihHDWnbH3FCTMLDXxDWe
</commit_message>
<xml_diff>
--- a/filesystem/ACTD/HR/Keeler_personnel.docx
+++ b/filesystem/ACTD/HR/Keeler_personnel.docx
@@ -2723,7 +2723,7 @@
                 <w:color w:val="1F2A37"/>
                 <w:sz w:val="19"/>
               </w:rPr>
-              <w:t>DMV pull-notice program (A54)</w:t>
+              <w:t>DMV pull-notice program (the Keeler DMV Driving Record)</w:t>
             </w:r>
             <w:r>
               <w:rPr>
@@ -4997,7 +4997,7 @@
                 <w:color w:val="1F2A37"/>
                 <w:sz w:val="19"/>
               </w:rPr>
-              <w:t>See separate compliance file (A05)</w:t>
+              <w:t>See separate compliance file (the DOT Post-Accident Test Record)</w:t>
             </w:r>
           </w:p>
         </w:tc>

</xml_diff>